<commit_message>
Rename interviewee to Amir, add interviewers and villages to gender interviews
Co-Authored-By: Claude Fable 5.1 <noreply@anthropic.com>
Claude-Session: https://claude.ai/code/session_011Z9C2ptByc9jQga6MDruQz
</commit_message>
<xml_diff>
--- a/deliverables/ראיונות_מגדר_עבודה_משפחה_אסיל_ואמיר.docx
+++ b/deliverables/ראיונות_מגדר_עבודה_משפחה_אסיל_ואמיר.docx
@@ -26,6 +26,120 @@
     </w:p>
     <w:p>
       <w:pPr>
+        <w:keepNext w:val="false"/>
+        <w:bidi/>
+        <w:spacing w:after="40" w:line="360"/>
+        <w:jc w:val="right"/>
+      </w:pPr>
+      <w:r>
+        <w:rPr>
+          <w:noProof/>
+          <w:rFonts w:ascii="Times New Roman" w:cs="David" w:eastAsia="David" w:hAnsi="Times New Roman"/>
+          <w:b/>
+          <w:bCs/>
+          <w:i w:val="false"/>
+          <w:iCs w:val="false"/>
+          <w:sz w:val="24"/>
+          <w:szCs w:val="24"/>
+          <w:rtl/>
+        </w:rPr>
+        <w:t xml:space="preserve">מגישות: </w:t>
+      </w:r>
+      <w:r>
+        <w:rPr>
+          <w:noProof/>
+          <w:rFonts w:ascii="Times New Roman" w:cs="David" w:eastAsia="David" w:hAnsi="Times New Roman"/>
+          <w:b w:val="false"/>
+          <w:bCs w:val="false"/>
+          <w:i w:val="false"/>
+          <w:iCs w:val="false"/>
+          <w:sz w:val="24"/>
+          <w:szCs w:val="24"/>
+          <w:rtl/>
+        </w:rPr>
+        <w:t xml:space="preserve">חמזה בוסאינה, ת.ז. 052806668</w:t>
+      </w:r>
+      <w:r>
+        <w:rPr>
+          <w:noProof/>
+          <w:rFonts w:ascii="Times New Roman" w:cs="David" w:eastAsia="David" w:hAnsi="Times New Roman"/>
+          <w:b w:val="false"/>
+          <w:bCs w:val="false"/>
+          <w:i w:val="false"/>
+          <w:iCs w:val="false"/>
+          <w:sz w:val="24"/>
+          <w:szCs w:val="24"/>
+          <w:rtl/>
+        </w:rPr>
+        <w:t xml:space="preserve">      </w:t>
+      </w:r>
+      <w:r>
+        <w:rPr>
+          <w:noProof/>
+          <w:rFonts w:ascii="Times New Roman" w:cs="David" w:eastAsia="David" w:hAnsi="Times New Roman"/>
+          <w:b/>
+          <w:bCs/>
+          <w:i w:val="false"/>
+          <w:iCs w:val="false"/>
+          <w:sz w:val="24"/>
+          <w:szCs w:val="24"/>
+          <w:rtl/>
+        </w:rPr>
+        <w:t xml:space="preserve">מגדלין אבו טריף, ת.ז. 038140398: </w:t>
+      </w:r>
+      <w:r>
+        <w:rPr>
+          <w:noProof/>
+          <w:rFonts w:ascii="Times New Roman" w:cs="David" w:eastAsia="David" w:hAnsi="Times New Roman"/>
+          <w:b w:val="false"/>
+          <w:bCs w:val="false"/>
+          <w:i w:val="false"/>
+          <w:iCs w:val="false"/>
+          <w:sz w:val="24"/>
+          <w:szCs w:val="24"/>
+          <w:rtl/>
+        </w:rPr>
+        <w:t xml:space="preserve"/>
+      </w:r>
+    </w:p>
+    <w:p>
+      <w:pPr>
+        <w:keepNext w:val="false"/>
+        <w:bidi/>
+        <w:spacing w:after="40" w:line="360"/>
+        <w:jc w:val="right"/>
+      </w:pPr>
+      <w:r>
+        <w:rPr>
+          <w:noProof/>
+          <w:rFonts w:ascii="Times New Roman" w:cs="David" w:eastAsia="David" w:hAnsi="Times New Roman"/>
+          <w:b/>
+          <w:bCs/>
+          <w:i w:val="false"/>
+          <w:iCs w:val="false"/>
+          <w:sz w:val="24"/>
+          <w:szCs w:val="24"/>
+          <w:rtl/>
+        </w:rPr>
+        <w:t xml:space="preserve">הראיונות נערכו בבית ג'ן ובירכא. כל אחת מהמגישות ערכה ראיון אחד, לפי אותו מדריך ראיון.: </w:t>
+      </w:r>
+      <w:r>
+        <w:rPr>
+          <w:noProof/>
+          <w:rFonts w:ascii="Times New Roman" w:cs="David" w:eastAsia="David" w:hAnsi="Times New Roman"/>
+          <w:b w:val="false"/>
+          <w:bCs w:val="false"/>
+          <w:i w:val="false"/>
+          <w:iCs w:val="false"/>
+          <w:sz w:val="24"/>
+          <w:szCs w:val="24"/>
+          <w:rtl/>
+        </w:rPr>
+        <w:t xml:space="preserve"/>
+      </w:r>
+    </w:p>
+    <w:p>
+      <w:pPr>
         <w:keepNext/>
         <w:bidi/>
         <w:spacing w:after="120" w:before="240" w:line="360"/>
@@ -48,6 +162,84 @@
     </w:p>
     <w:p>
       <w:pPr>
+        <w:keepNext w:val="false"/>
+        <w:bidi/>
+        <w:spacing w:after="40" w:line="360"/>
+        <w:jc w:val="right"/>
+      </w:pPr>
+      <w:r>
+        <w:rPr>
+          <w:noProof/>
+          <w:rFonts w:ascii="Times New Roman" w:cs="David" w:eastAsia="David" w:hAnsi="Times New Roman"/>
+          <w:b/>
+          <w:bCs/>
+          <w:i w:val="false"/>
+          <w:iCs w:val="false"/>
+          <w:sz w:val="24"/>
+          <w:szCs w:val="24"/>
+          <w:rtl/>
+        </w:rPr>
+        <w:t xml:space="preserve">מראיינת: </w:t>
+      </w:r>
+      <w:r>
+        <w:rPr>
+          <w:noProof/>
+          <w:rFonts w:ascii="Times New Roman" w:cs="David" w:eastAsia="David" w:hAnsi="Times New Roman"/>
+          <w:b w:val="false"/>
+          <w:bCs w:val="false"/>
+          <w:i w:val="false"/>
+          <w:iCs w:val="false"/>
+          <w:sz w:val="24"/>
+          <w:szCs w:val="24"/>
+          <w:rtl/>
+        </w:rPr>
+        <w:t xml:space="preserve">חמזה בוסאינה</w:t>
+      </w:r>
+      <w:r>
+        <w:rPr>
+          <w:noProof/>
+          <w:rFonts w:ascii="Times New Roman" w:cs="David" w:eastAsia="David" w:hAnsi="Times New Roman"/>
+          <w:b w:val="false"/>
+          <w:bCs w:val="false"/>
+          <w:i w:val="false"/>
+          <w:iCs w:val="false"/>
+          <w:sz w:val="24"/>
+          <w:szCs w:val="24"/>
+          <w:rtl/>
+        </w:rPr>
+        <w:t xml:space="preserve">      </w:t>
+      </w:r>
+      <w:r>
+        <w:rPr>
+          <w:noProof/>
+          <w:rFonts w:ascii="Times New Roman" w:cs="David" w:eastAsia="David" w:hAnsi="Times New Roman"/>
+          <w:b/>
+          <w:bCs/>
+          <w:i w:val="false"/>
+          <w:iCs w:val="false"/>
+          <w:sz w:val="24"/>
+          <w:szCs w:val="24"/>
+          <w:rtl/>
+        </w:rPr>
+        <w:t xml:space="preserve">מקום הראיון: </w:t>
+      </w:r>
+      <w:r>
+        <w:rPr>
+          <w:noProof/>
+          <w:rFonts w:ascii="Times New Roman" w:cs="David" w:eastAsia="David" w:hAnsi="Times New Roman"/>
+          <w:b w:val="false"/>
+          <w:bCs w:val="false"/>
+          <w:i w:val="false"/>
+          <w:iCs w:val="false"/>
+          <w:sz w:val="24"/>
+          <w:szCs w:val="24"/>
+          <w:rtl/>
+        </w:rPr>
+        <w:t xml:space="preserve">בית ג'ן, בבית המרואיינת</w:t>
+      </w:r>
+    </w:p>
+    <w:p>
+      <w:pPr>
         <w:keepNext/>
         <w:bidi/>
         <w:spacing w:after="60" w:before="240" w:line="360"/>
@@ -87,7 +279,7 @@
           <w:szCs w:val="24"/>
           <w:rtl/>
         </w:rPr>
-        <w:t xml:space="preserve">הוסבר למרואיינת שהראיון נערך לצורך עבודה בקורס, ששמה לא יופיע בעבודה (ייכתב "מרואיינת א'"), ושאפשר לדלג על כל שאלה. המרואיינת הסכימה. הראיון נערך בביתה אחרי שהילדים נרדמו, ברישום בזמן אמת וללא הקלטה.</w:t>
+        <w:t xml:space="preserve">הוסבר למרואיינת שהראיון נערך לצורך עבודה בקורס, ששמה לא יופיע בעבודה (ייכתב "מרואיינת א'"), ושאפשר לדלג על כל שאלה. המרואיינת הסכימה. הראיון נערך בביתה בבית ג'ן אחרי שהילדים נרדמו, ברישום בזמן אמת וללא הקלטה.</w:t>
       </w:r>
     </w:p>
     <w:p>
@@ -259,7 +451,7 @@
           <w:szCs w:val="24"/>
           <w:rtl/>
         </w:rPr>
-        <w:t xml:space="preserve">אחות מוסמכת במחלקה פנימית בבית חולים, 80% משרה (ארבע משמרות בשבוע, כולל משמרת לילה אחת)</w:t>
+        <w:t xml:space="preserve">אחות מוסמכת במחלקה פנימית בבית חולים בנהריה, 80% משרה (ארבע משמרות בשבוע, כולל משמרת לילה אחת)</w:t>
       </w:r>
     </w:p>
     <w:p>
@@ -1889,7 +2081,85 @@
           <w:szCs w:val="28"/>
           <w:rtl/>
         </w:rPr>
-        <w:t xml:space="preserve">ראיון עם אחמד (מרואיין ב')</w:t>
+        <w:t xml:space="preserve">ראיון עם אמיר (מרואיין ב')</w:t>
+      </w:r>
+    </w:p>
+    <w:p>
+      <w:pPr>
+        <w:keepNext w:val="false"/>
+        <w:bidi/>
+        <w:spacing w:after="40" w:line="360"/>
+        <w:jc w:val="right"/>
+      </w:pPr>
+      <w:r>
+        <w:rPr>
+          <w:noProof/>
+          <w:rFonts w:ascii="Times New Roman" w:cs="David" w:eastAsia="David" w:hAnsi="Times New Roman"/>
+          <w:b/>
+          <w:bCs/>
+          <w:i w:val="false"/>
+          <w:iCs w:val="false"/>
+          <w:sz w:val="24"/>
+          <w:szCs w:val="24"/>
+          <w:rtl/>
+        </w:rPr>
+        <w:t xml:space="preserve">מראיינת: </w:t>
+      </w:r>
+      <w:r>
+        <w:rPr>
+          <w:noProof/>
+          <w:rFonts w:ascii="Times New Roman" w:cs="David" w:eastAsia="David" w:hAnsi="Times New Roman"/>
+          <w:b w:val="false"/>
+          <w:bCs w:val="false"/>
+          <w:i w:val="false"/>
+          <w:iCs w:val="false"/>
+          <w:sz w:val="24"/>
+          <w:szCs w:val="24"/>
+          <w:rtl/>
+        </w:rPr>
+        <w:t xml:space="preserve">מגדלין אבו טריף</w:t>
+      </w:r>
+      <w:r>
+        <w:rPr>
+          <w:noProof/>
+          <w:rFonts w:ascii="Times New Roman" w:cs="David" w:eastAsia="David" w:hAnsi="Times New Roman"/>
+          <w:b w:val="false"/>
+          <w:bCs w:val="false"/>
+          <w:i w:val="false"/>
+          <w:iCs w:val="false"/>
+          <w:sz w:val="24"/>
+          <w:szCs w:val="24"/>
+          <w:rtl/>
+        </w:rPr>
+        <w:t xml:space="preserve">      </w:t>
+      </w:r>
+      <w:r>
+        <w:rPr>
+          <w:noProof/>
+          <w:rFonts w:ascii="Times New Roman" w:cs="David" w:eastAsia="David" w:hAnsi="Times New Roman"/>
+          <w:b/>
+          <w:bCs/>
+          <w:i w:val="false"/>
+          <w:iCs w:val="false"/>
+          <w:sz w:val="24"/>
+          <w:szCs w:val="24"/>
+          <w:rtl/>
+        </w:rPr>
+        <w:t xml:space="preserve">מקום הראיון: </w:t>
+      </w:r>
+      <w:r>
+        <w:rPr>
+          <w:noProof/>
+          <w:rFonts w:ascii="Times New Roman" w:cs="David" w:eastAsia="David" w:hAnsi="Times New Roman"/>
+          <w:b w:val="false"/>
+          <w:bCs w:val="false"/>
+          <w:i w:val="false"/>
+          <w:iCs w:val="false"/>
+          <w:sz w:val="24"/>
+          <w:szCs w:val="24"/>
+          <w:rtl/>
+        </w:rPr>
+        <w:t xml:space="preserve">ירכא, במשרדו של המרואיין</w:t>
       </w:r>
     </w:p>
     <w:p>
@@ -1933,7 +2203,7 @@
           <w:szCs w:val="24"/>
           <w:rtl/>
         </w:rPr>
-        <w:t xml:space="preserve">הוסבר למרואיין שהראיון נערך לצורך עבודה בקורס, ששמו לא יופיע בעבודה (ייכתב "מרואיין ב'"), ושאפשר לדלג על כל שאלה. המרואיין הסכים. הראיון נערך במשרדו בשעות אחר הצהריים, ברישום בזמן אמת וללא הקלטה.</w:t>
+        <w:t xml:space="preserve">הוסבר למרואיין שהראיון נערך לצורך עבודה בקורס, ששמו לא יופיע בעבודה (ייכתב "מרואיין ב'"), ושאפשר לדלג על כל שאלה. המרואיין הסכים. הראיון נערך במשרדו בירכא בשעות אחר הצהריים, ברישום בזמן אמת וללא הקלטה.</w:t>
       </w:r>
     </w:p>
     <w:p>
@@ -2301,7 +2571,7 @@
           <w:szCs w:val="24"/>
           <w:rtl/>
         </w:rPr>
-        <w:t xml:space="preserve">אבא שלי היה פועל בניין, ואמא בבית. הייתי הבן הבכור, ומגיל קטן היה ברור שאני אלמד, כי אבא לא רצה שאעבוד בגוף כמוהו. בתיכון הייתי חזק במתמטיקה, ומישהו מהמשפחה, בן דוד שהיה פקיד בבנק, אמר לאבא "ראיית חשבון זה מקצוע שיש בו פרנסה ואף אחד לא יכול לקחת לך אותו". זה נכנס לי לראש. למדתי כלכלה וחשבונאות, עשיתי התמחות במשרד גדול בחיפה, חמש שנים של עבודה מטורפת, ובגיל שלושים ושתיים פתחתי משרד משלי בעיר.</w:t>
+        <w:t xml:space="preserve">אבא שלי היה פועל בניין, ואמא בבית. הייתי הבן הבכור, ומגיל קטן היה ברור שאני אלמד, כי אבא לא רצה שאעבוד בגוף כמוהו. בתיכון הייתי חזק במתמטיקה, ומישהו מהמשפחה, בן דוד שהיה פקיד בבנק, אמר לאבא "ראיית חשבון זה מקצוע שיש בו פרנסה ואף אחד לא יכול לקחת לך אותו". זה נכנס לי לראש. למדתי כלכלה וחשבונאות, עשיתי התמחות במשרד גדול בחיפה, חמש שנים של עבודה מטורפת, ובגיל שלושים ושתיים פתחתי משרד משלי בירכא.</w:t>
       </w:r>
     </w:p>
     <w:p>
@@ -2389,7 +2659,7 @@
           <w:szCs w:val="24"/>
           <w:rtl/>
         </w:rPr>
-        <w:t xml:space="preserve">בהתחלה רציתי להגיד שלא, ואז חשבתי. המשרד הגדול בחיפה הציע לי להיות שותף זוטר אם אשאר עוד שלוש שנים. זה היה אומר להישאר בחיפה, שעות של עשר בלילה, ובת הזוג שלי עם שני ילדים קטנים בכפר, כי לא רצינו לגדל אותם בעיר, והיא לא רצתה להתרחק מההורים שלה. אז פתחתי משרד בעיר שלנו. מבחינת הכסף והמעמד ויתרתי, אם הייתי נשאר הייתי היום במקום אחר. אבל אני לא בטוח שזה "בגלל המשפחה" במובן שאת שואלת. לא ויתרתי כדי להיות יותר בבית. ויתרתי כדי שהמשפחה תהיה במקום שהמשפחה רצתה, ואני אמשיך לעבוד כמו שעבדתי, רק קרוב יותר.</w:t>
+        <w:t xml:space="preserve">בהתחלה רציתי להגיד שלא, ואז חשבתי. המשרד הגדול בחיפה הציע לי להיות שותף זוטר אם אשאר עוד שלוש שנים. זה היה אומר להישאר בחיפה, שעות של עשר בלילה, ובת הזוג שלי עם שני ילדים קטנים בירכא, כי לא רצינו לגדל אותם בעיר, והיא לא רצתה להתרחק מההורים שלה. אז פתחתי משרד בכפר. מבחינת הכסף והמעמד ויתרתי, אם הייתי נשאר הייתי היום במקום אחר. אבל אני לא בטוח שזה "בגלל המשפחה" במובן שאת שואלת. לא ויתרתי כדי להיות יותר בבית. ויתרתי כדי שהמשפחה תהיה במקום שהמשפחה רצתה, ואני אמשיך לעבוד כמו שעבדתי, רק קרוב יותר.</w:t>
       </w:r>
     </w:p>
     <w:p>

</xml_diff>